<commit_message>
More chemical analysis notes
</commit_message>
<xml_diff>
--- a/Projects/Chapter2/chemical-analysis-notes.docx
+++ b/Projects/Chapter2/chemical-analysis-notes.docx
@@ -580,10 +580,7 @@
               <w:cnfStyle w:val="000000000000" w:firstRow="0" w:lastRow="0" w:firstColumn="0" w:lastColumn="0" w:oddVBand="0" w:evenVBand="0" w:oddHBand="0" w:evenHBand="0" w:firstRowFirstColumn="0" w:firstRowLastColumn="0" w:lastRowFirstColumn="0" w:lastRowLastColumn="0"/>
             </w:pPr>
             <w:r>
-              <w:t>O</w:t>
-            </w:r>
-            <w:r>
-              <w:t>xygen electrode connected to an in-line amplifier, connected to a data-logging meter</w:t>
+              <w:t>Oxygen electrode connected to an in-line amplifier, connected to a data-logging meter</w:t>
             </w:r>
           </w:p>
         </w:tc>
@@ -768,10 +765,7 @@
               <w:sym w:font="Symbol" w:char="F06D"/>
             </w:r>
             <w:r>
-              <w:t>m cellulose acetate membrane in the field and store in prewashed poly</w:t>
-            </w:r>
-            <w:r>
-              <w:t>ethylene tubes and acidified with HNO</w:t>
+              <w:t>m cellulose acetate membrane in the field and store in prewashed polyethylene tubes and acidified with HNO</w:t>
             </w:r>
             <w:r>
               <w:rPr>
@@ -880,10 +874,7 @@
               <w:sym w:font="Symbol" w:char="F06D"/>
             </w:r>
             <w:r>
-              <w:t>m cellulose acetate membrane and store in</w:t>
-            </w:r>
-            <w:r>
-              <w:t xml:space="preserve"> acid-washed amber glad bottles and </w:t>
+              <w:t xml:space="preserve">m cellulose acetate membrane and store in acid-washed amber glad bottles and </w:t>
             </w:r>
             <w:proofErr w:type="spellStart"/>
             <w:r>
@@ -899,10 +890,7 @@
             </w:r>
             <w:proofErr w:type="spellEnd"/>
             <w:r>
-              <w:t xml:space="preserve"> </w:t>
-            </w:r>
-            <w:r>
-              <w:t>in the field</w:t>
+              <w:t xml:space="preserve"> in the field</w:t>
             </w:r>
           </w:p>
         </w:tc>
@@ -968,13 +956,7 @@
               <w:cnfStyle w:val="000000000000" w:firstRow="0" w:lastRow="0" w:firstColumn="0" w:lastColumn="0" w:oddVBand="0" w:evenVBand="0" w:oddHBand="0" w:evenHBand="0" w:firstRowFirstColumn="0" w:firstRowLastColumn="0" w:lastRowFirstColumn="0" w:lastRowLastColumn="0"/>
             </w:pPr>
             <w:r>
-              <w:t xml:space="preserve">Calibrated, fast response </w:t>
-            </w:r>
-            <w:r>
-              <w:t>oxygen electrode connected to an in-line amplifier, connected to a data-logging meter</w:t>
-            </w:r>
-            <w:r>
-              <w:t xml:space="preserve">. LOD = </w:t>
+              <w:t xml:space="preserve">Calibrated, fast response oxygen electrode connected to an in-line amplifier, connected to a data-logging meter. LOD = </w:t>
             </w:r>
             <w:r>
               <w:t>﻿0.1 mg L-1</w:t>
@@ -1293,10 +1275,7 @@
         <w:sym w:font="Symbol" w:char="F06D"/>
       </w:r>
       <w:r>
-        <w:t>m</w:t>
-      </w:r>
-      <w:r>
-        <w:t xml:space="preserve"> cellulose acetate filter papers for cation and anion analysis, but wouldn’t recommend them for DOC analysis. </w:t>
+        <w:t xml:space="preserve">m cellulose acetate filter papers for cation and anion analysis, but wouldn’t recommend them for DOC analysis. </w:t>
       </w:r>
       <w:r>
         <w:t>0.7 um GF/F</w:t>
@@ -1506,7 +1485,7 @@
       <w:r>
         <w:t xml:space="preserve"> (</w:t>
       </w:r>
-      <w:hyperlink r:id="rId9" w:history="1">
+      <w:hyperlink r:id="rId9" w:anchor=":~:text=Polypropylene%20(PP)%20%E2%80%93%20can%20be,and%20aromatic%20or%20chlorinated%20solvents" w:history="1">
         <w:r>
           <w:rPr>
             <w:rStyle w:val="Hyperlink"/>
@@ -1712,16 +1691,7 @@
         </w:numPr>
       </w:pPr>
       <w:r>
-        <w:t xml:space="preserve">Diameter: </w:t>
-      </w:r>
-      <w:r>
-        <w:t>Syringe filter size is determined by the size of your sample. In other words, the amount of volume you plan to push through the filter.</w:t>
-      </w:r>
-      <w:r>
-        <w:t xml:space="preserve"> </w:t>
-      </w:r>
-      <w:r>
-        <w:t>As a general rule, use a syringe filter with a greater membrane area if you plan to push a high volume of aqueous solution through it.</w:t>
+        <w:t>Diameter: Syringe filter size is determined by the size of your sample. In other words, the amount of volume you plan to push through the filter. As a general rule, use a syringe filter with a greater membrane area if you plan to push a high volume of aqueous solution through it.</w:t>
       </w:r>
     </w:p>
     <w:p>
@@ -1820,90 +1790,96 @@
       <w:r>
         <w:t>Sterile if you want a sterilized aqueous solution, nonsterile if you’ll be sterilizing later</w:t>
       </w:r>
+    </w:p>
+    <w:p/>
+    <w:p>
+      <w:r>
+        <w:t>DOC Questions:</w:t>
+      </w:r>
+    </w:p>
+    <w:p>
+      <w:pPr>
+        <w:pStyle w:val="ListParagraph"/>
+        <w:numPr>
+          <w:ilvl w:val="0"/>
+          <w:numId w:val="5"/>
+        </w:numPr>
+      </w:pPr>
+      <w:r>
+        <w:t>Are there enough glass jars in the lab to melt my samples for DOC?</w:t>
+      </w:r>
+    </w:p>
+    <w:p>
+      <w:pPr>
+        <w:pStyle w:val="ListParagraph"/>
+        <w:numPr>
+          <w:ilvl w:val="0"/>
+          <w:numId w:val="5"/>
+        </w:numPr>
+      </w:pPr>
+      <w:r>
+        <w:t xml:space="preserve">Can I get these jars prepped and shipped to Svalbard in time, or alternatively, can I bring them in my luggage? </w:t>
+      </w:r>
+    </w:p>
+    <w:p>
+      <w:pPr>
+        <w:pStyle w:val="ListParagraph"/>
+        <w:numPr>
+          <w:ilvl w:val="0"/>
+          <w:numId w:val="5"/>
+        </w:numPr>
+      </w:pPr>
+      <w:r>
+        <w:t xml:space="preserve">Is it appropriate to use plastic syringes for DOC samples? </w:t>
+      </w:r>
+    </w:p>
+    <w:p>
+      <w:pPr>
+        <w:pStyle w:val="ListParagraph"/>
+        <w:numPr>
+          <w:ilvl w:val="0"/>
+          <w:numId w:val="5"/>
+        </w:numPr>
+      </w:pPr>
+      <w:r>
+        <w:t>What other methods are comm</w:t>
+      </w:r>
+      <w:r>
+        <w:t>only</w:t>
+      </w:r>
+      <w:r>
+        <w:t xml:space="preserve"> used for supraglacial DOC analysis, apart from using glass syringes/metal housing/glass fibre filters/</w:t>
+      </w:r>
+      <w:proofErr w:type="spellStart"/>
+      <w:r>
+        <w:t>HCl</w:t>
+      </w:r>
+      <w:proofErr w:type="spellEnd"/>
+      <w:r>
+        <w:t>?</w:t>
+      </w:r>
+    </w:p>
+    <w:p>
+      <w:pPr>
+        <w:pStyle w:val="ListParagraph"/>
+        <w:numPr>
+          <w:ilvl w:val="0"/>
+          <w:numId w:val="5"/>
+        </w:numPr>
+      </w:pPr>
+      <w:r>
+        <w:t>If plastic syringes are not appropriate and there are no other alternatives, can I acquire glass syringes/metal housing/glass fibre filters/</w:t>
+      </w:r>
+      <w:proofErr w:type="spellStart"/>
+      <w:r>
+        <w:t>HCl</w:t>
+      </w:r>
+      <w:proofErr w:type="spellEnd"/>
+      <w:r>
+        <w:t xml:space="preserve"> and get the training to use them safely in the field? </w:t>
+      </w:r>
       <w:bookmarkStart w:id="0" w:name="_GoBack"/>
       <w:bookmarkEnd w:id="0"/>
-    </w:p>
-    <w:p/>
-    <w:p>
-      <w:r>
-        <w:t>DOC Questions:</w:t>
-      </w:r>
-    </w:p>
-    <w:p>
-      <w:pPr>
-        <w:pStyle w:val="ListParagraph"/>
-        <w:numPr>
-          <w:ilvl w:val="0"/>
-          <w:numId w:val="5"/>
-        </w:numPr>
-      </w:pPr>
-      <w:r>
-        <w:t>Are there enough glass jars in the lab to melt my samples for DOC?</w:t>
-      </w:r>
-    </w:p>
-    <w:p>
-      <w:pPr>
-        <w:pStyle w:val="ListParagraph"/>
-        <w:numPr>
-          <w:ilvl w:val="0"/>
-          <w:numId w:val="5"/>
-        </w:numPr>
-      </w:pPr>
-      <w:r>
-        <w:t xml:space="preserve">Can I get these jars prepped and shipped to Svalbard in time, or alternatively, can I bring them in my luggage? </w:t>
-      </w:r>
-    </w:p>
-    <w:p>
-      <w:pPr>
-        <w:pStyle w:val="ListParagraph"/>
-        <w:numPr>
-          <w:ilvl w:val="0"/>
-          <w:numId w:val="5"/>
-        </w:numPr>
-      </w:pPr>
-      <w:r>
-        <w:t xml:space="preserve">Is it appropriate to use plastic syringes for DOC samples? </w:t>
-      </w:r>
-    </w:p>
-    <w:p>
-      <w:pPr>
-        <w:pStyle w:val="ListParagraph"/>
-        <w:numPr>
-          <w:ilvl w:val="0"/>
-          <w:numId w:val="5"/>
-        </w:numPr>
-      </w:pPr>
-      <w:r>
-        <w:t>What other methods are community used for supraglacial DOC analysis, apart from using glass syringes/metal housing/glass fibre filters/</w:t>
-      </w:r>
-      <w:proofErr w:type="spellStart"/>
-      <w:r>
-        <w:t>HCl</w:t>
-      </w:r>
-      <w:proofErr w:type="spellEnd"/>
-      <w:r>
-        <w:t>?</w:t>
-      </w:r>
-    </w:p>
-    <w:p>
-      <w:pPr>
-        <w:pStyle w:val="ListParagraph"/>
-        <w:numPr>
-          <w:ilvl w:val="0"/>
-          <w:numId w:val="5"/>
-        </w:numPr>
-      </w:pPr>
-      <w:r>
-        <w:t>If plastic syringes are not appropriate and there are no other alternatives, can I acquire glass syringes/metal housing/glass fibre filters/</w:t>
-      </w:r>
-      <w:proofErr w:type="spellStart"/>
-      <w:r>
-        <w:t>HCl</w:t>
-      </w:r>
-      <w:proofErr w:type="spellEnd"/>
-      <w:r>
-        <w:t xml:space="preserve"> and get the training to use them safely in the field? </w:t>
-      </w:r>
     </w:p>
     <w:p>
       <w:pPr>
@@ -3861,7 +3837,7 @@
 </file>
 
 <file path=customXml/itemProps1.xml><?xml version="1.0" encoding="utf-8"?>
-<ds:datastoreItem xmlns:ds="http://schemas.openxmlformats.org/officeDocument/2006/customXml" ds:itemID="{30DD4AC7-F9A7-A14B-AEC7-9A52ADB01095}">
+<ds:datastoreItem xmlns:ds="http://schemas.openxmlformats.org/officeDocument/2006/customXml" ds:itemID="{C86F7301-339A-D844-B645-81E71A050782}">
   <ds:schemaRefs>
     <ds:schemaRef ds:uri="http://schemas.openxmlformats.org/officeDocument/2006/bibliography"/>
   </ds:schemaRefs>

</xml_diff>